<commit_message>
docs: update testing evidence for Playwright coverage
</commit_message>
<xml_diff>
--- a/pruebas/3.2-Diseno-de-Casos-de-Prueba-BrainSort.docx
+++ b/pruebas/3.2-Diseno-de-Casos-de-Prueba-BrainSort.docx
@@ -158,7 +158,7 @@
           </w:tcPr>
           <w:p>
             <w:r>
-              <w:t>52 casos de prueba (52 Paso | 0 Fallo | 0 Bloqueado | 0 Pendiente)</w:t>
+              <w:t>55 casos de prueba (55 Paso | 0 Fallo | 0 Bloqueado | 0 Pendiente)</w:t>
             </w:r>
           </w:p>
         </w:tc>
@@ -680,7 +680,7 @@
               <w:rPr>
                 <w:sz w:val="17"/>
               </w:rPr>
-              <w:t>52</w:t>
+              <w:t>55</w:t>
             </w:r>
           </w:p>
         </w:tc>
@@ -12552,6 +12552,720 @@
                 <w:sz w:val="16"/>
               </w:rPr>
               <w:t>Evidencia automatizada en src/utils/__tests__/xp.utils.test.ts. Resultado del ciclo: Paso.</w:t>
+            </w:r>
+          </w:p>
+        </w:tc>
+      </w:tr>
+    </w:tbl>
+    <w:p/>
+    <w:p>
+      <w:pPr>
+        <w:pStyle w:val="Heading1"/>
+      </w:pPr>
+      <w:r>
+        <w:t>22. MODULO: LOGIN UI</w:t>
+      </w:r>
+    </w:p>
+    <w:p>
+      <w:r>
+        <w:t>Modulo cubierto por pruebas automatizadas del proyecto BrainSort.</w:t>
+      </w:r>
+    </w:p>
+    <w:p>
+      <w:pPr>
+        <w:pStyle w:val="Heading2"/>
+      </w:pPr>
+      <w:r>
+        <w:t>Casos de prueba — Login UI</w:t>
+      </w:r>
+    </w:p>
+    <w:tbl>
+      <w:tblPr>
+        <w:tblStyle w:val="LightGrid-Accent1"/>
+        <w:tblW w:type="auto" w:w="0"/>
+        <w:jc w:val="center"/>
+        <w:tblLook w:firstColumn="1" w:firstRow="1" w:lastColumn="0" w:lastRow="0" w:noHBand="0" w:noVBand="1" w:val="04A0"/>
+      </w:tblPr>
+      <w:tblGrid>
+        <w:gridCol w:w="4968"/>
+        <w:gridCol w:w="4968"/>
+      </w:tblGrid>
+      <w:tr>
+        <w:tc>
+          <w:tcPr>
+            <w:tcW w:type="dxa" w:w="9936"/>
+            <w:gridSpan w:val="2"/>
+          </w:tcPr>
+          <w:p>
+            <w:r>
+              <w:rPr>
+                <w:b/>
+                <w:color w:val="1F3A5F"/>
+                <w:sz w:val="19"/>
+              </w:rPr>
+              <w:t>CP-FE-E2E-001 — Login desde pantalla web</w:t>
+            </w:r>
+          </w:p>
+        </w:tc>
+      </w:tr>
+      <w:tr>
+        <w:tc>
+          <w:tcPr>
+            <w:tcW w:type="dxa" w:w="2304"/>
+            <w:vAlign w:val="top"/>
+          </w:tcPr>
+          <w:p>
+            <w:r>
+              <w:rPr>
+                <w:b/>
+                <w:sz w:val="16"/>
+              </w:rPr>
+              <w:t>Modulo / HU / Tipo / Prioridad / Estado</w:t>
+            </w:r>
+          </w:p>
+        </w:tc>
+        <w:tc>
+          <w:tcPr>
+            <w:tcW w:type="dxa" w:w="4968"/>
+            <w:vAlign w:val="top"/>
+          </w:tcPr>
+          <w:p>
+            <w:r>
+              <w:rPr>
+                <w:sz w:val="16"/>
+              </w:rPr>
+              <w:t>Login UI | RF-AUTH | E2E Web | Critica | Paso</w:t>
+            </w:r>
+          </w:p>
+        </w:tc>
+      </w:tr>
+      <w:tr>
+        <w:tc>
+          <w:tcPr>
+            <w:tcW w:type="dxa" w:w="2304"/>
+            <w:vAlign w:val="top"/>
+          </w:tcPr>
+          <w:p>
+            <w:r>
+              <w:rPr>
+                <w:b/>
+                <w:sz w:val="16"/>
+              </w:rPr>
+              <w:t>Precondiciones</w:t>
+            </w:r>
+          </w:p>
+        </w:tc>
+        <w:tc>
+          <w:tcPr>
+            <w:tcW w:type="dxa" w:w="4968"/>
+            <w:vAlign w:val="top"/>
+          </w:tcPr>
+          <w:p>
+            <w:r>
+              <w:rPr>
+                <w:sz w:val="16"/>
+              </w:rPr>
+              <w:t>Expo Web levantado y API mockeada</w:t>
+            </w:r>
+          </w:p>
+        </w:tc>
+      </w:tr>
+      <w:tr>
+        <w:tc>
+          <w:tcPr>
+            <w:tcW w:type="dxa" w:w="2304"/>
+            <w:vAlign w:val="top"/>
+          </w:tcPr>
+          <w:p>
+            <w:r>
+              <w:rPr>
+                <w:b/>
+                <w:sz w:val="16"/>
+              </w:rPr>
+              <w:t>Datos de entrada</w:t>
+            </w:r>
+          </w:p>
+        </w:tc>
+        <w:tc>
+          <w:tcPr>
+            <w:tcW w:type="dxa" w:w="4968"/>
+            <w:vAlign w:val="top"/>
+          </w:tcPr>
+          <w:p>
+            <w:r>
+              <w:rPr>
+                <w:sz w:val="16"/>
+              </w:rPr>
+              <w:t>correo y contrasena validos</w:t>
+            </w:r>
+          </w:p>
+        </w:tc>
+      </w:tr>
+      <w:tr>
+        <w:tc>
+          <w:tcPr>
+            <w:tcW w:type="dxa" w:w="2304"/>
+            <w:vAlign w:val="top"/>
+          </w:tcPr>
+          <w:p>
+            <w:r>
+              <w:rPr>
+                <w:b/>
+                <w:sz w:val="16"/>
+              </w:rPr>
+              <w:t>Pasos de ejecucion</w:t>
+            </w:r>
+          </w:p>
+        </w:tc>
+        <w:tc>
+          <w:tcPr>
+            <w:tcW w:type="dxa" w:w="4968"/>
+            <w:vAlign w:val="top"/>
+          </w:tcPr>
+          <w:p>
+            <w:r>
+              <w:rPr>
+                <w:sz w:val="16"/>
+              </w:rPr>
+              <w:t>1. Preparar el entorno de pruebas del modulo Login UI. 2. Ejecutar npm test -- --runInBand. 3. Localizar el caso CP-FE-E2E-001 en e2e/app-flows.spec.ts. 4. Usar datos de entrada: correo y contrasena validos. 5. Comparar la salida observada contra el resultado esperado. 6. Registrar estado y evidencia en el informe de ciclo.</w:t>
+            </w:r>
+          </w:p>
+        </w:tc>
+      </w:tr>
+      <w:tr>
+        <w:tc>
+          <w:tcPr>
+            <w:tcW w:type="dxa" w:w="2304"/>
+            <w:vAlign w:val="top"/>
+          </w:tcPr>
+          <w:p>
+            <w:r>
+              <w:rPr>
+                <w:b/>
+                <w:sz w:val="16"/>
+              </w:rPr>
+              <w:t>Resultado esperado</w:t>
+            </w:r>
+          </w:p>
+        </w:tc>
+        <w:tc>
+          <w:tcPr>
+            <w:tcW w:type="dxa" w:w="4968"/>
+            <w:vAlign w:val="top"/>
+          </w:tcPr>
+          <w:p>
+            <w:r>
+              <w:rPr>
+                <w:sz w:val="16"/>
+              </w:rPr>
+              <w:t>Autentica y muestra navegacion principal</w:t>
+            </w:r>
+          </w:p>
+        </w:tc>
+      </w:tr>
+      <w:tr>
+        <w:tc>
+          <w:tcPr>
+            <w:tcW w:type="dxa" w:w="2304"/>
+            <w:vAlign w:val="top"/>
+          </w:tcPr>
+          <w:p>
+            <w:r>
+              <w:rPr>
+                <w:b/>
+                <w:sz w:val="16"/>
+              </w:rPr>
+              <w:t>Notas / Evidencia</w:t>
+            </w:r>
+          </w:p>
+        </w:tc>
+        <w:tc>
+          <w:tcPr>
+            <w:tcW w:type="dxa" w:w="4968"/>
+            <w:vAlign w:val="top"/>
+          </w:tcPr>
+          <w:p>
+            <w:r>
+              <w:rPr>
+                <w:sz w:val="16"/>
+              </w:rPr>
+              <w:t>Evidencia automatizada en e2e/app-flows.spec.ts. Resultado del ciclo: Paso.</w:t>
+            </w:r>
+          </w:p>
+        </w:tc>
+      </w:tr>
+    </w:tbl>
+    <w:p/>
+    <w:p>
+      <w:pPr>
+        <w:pStyle w:val="Heading1"/>
+      </w:pPr>
+      <w:r>
+        <w:t>23. MODULO: RUTA UI</w:t>
+      </w:r>
+    </w:p>
+    <w:p>
+      <w:r>
+        <w:t>Modulo cubierto por pruebas automatizadas del proyecto BrainSort.</w:t>
+      </w:r>
+    </w:p>
+    <w:p>
+      <w:pPr>
+        <w:pStyle w:val="Heading2"/>
+      </w:pPr>
+      <w:r>
+        <w:t>Casos de prueba — Ruta UI</w:t>
+      </w:r>
+    </w:p>
+    <w:tbl>
+      <w:tblPr>
+        <w:tblStyle w:val="LightGrid-Accent1"/>
+        <w:tblW w:type="auto" w:w="0"/>
+        <w:jc w:val="center"/>
+        <w:tblLook w:firstColumn="1" w:firstRow="1" w:lastColumn="0" w:lastRow="0" w:noHBand="0" w:noVBand="1" w:val="04A0"/>
+      </w:tblPr>
+      <w:tblGrid>
+        <w:gridCol w:w="4968"/>
+        <w:gridCol w:w="4968"/>
+      </w:tblGrid>
+      <w:tr>
+        <w:tc>
+          <w:tcPr>
+            <w:tcW w:type="dxa" w:w="9936"/>
+            <w:gridSpan w:val="2"/>
+          </w:tcPr>
+          <w:p>
+            <w:r>
+              <w:rPr>
+                <w:b/>
+                <w:color w:val="1F3A5F"/>
+                <w:sz w:val="19"/>
+              </w:rPr>
+              <w:t>CP-FE-E2E-002 — Ruta de aprendizaje visible</w:t>
+            </w:r>
+          </w:p>
+        </w:tc>
+      </w:tr>
+      <w:tr>
+        <w:tc>
+          <w:tcPr>
+            <w:tcW w:type="dxa" w:w="2304"/>
+            <w:vAlign w:val="top"/>
+          </w:tcPr>
+          <w:p>
+            <w:r>
+              <w:rPr>
+                <w:b/>
+                <w:sz w:val="16"/>
+              </w:rPr>
+              <w:t>Modulo / HU / Tipo / Prioridad / Estado</w:t>
+            </w:r>
+          </w:p>
+        </w:tc>
+        <w:tc>
+          <w:tcPr>
+            <w:tcW w:type="dxa" w:w="4968"/>
+            <w:vAlign w:val="top"/>
+          </w:tcPr>
+          <w:p>
+            <w:r>
+              <w:rPr>
+                <w:sz w:val="16"/>
+              </w:rPr>
+              <w:t>Ruta UI | RF-RUTA | E2E Web | Alta | Paso</w:t>
+            </w:r>
+          </w:p>
+        </w:tc>
+      </w:tr>
+      <w:tr>
+        <w:tc>
+          <w:tcPr>
+            <w:tcW w:type="dxa" w:w="2304"/>
+            <w:vAlign w:val="top"/>
+          </w:tcPr>
+          <w:p>
+            <w:r>
+              <w:rPr>
+                <w:b/>
+                <w:sz w:val="16"/>
+              </w:rPr>
+              <w:t>Precondiciones</w:t>
+            </w:r>
+          </w:p>
+        </w:tc>
+        <w:tc>
+          <w:tcPr>
+            <w:tcW w:type="dxa" w:w="4968"/>
+            <w:vAlign w:val="top"/>
+          </w:tcPr>
+          <w:p>
+            <w:r>
+              <w:rPr>
+                <w:sz w:val="16"/>
+              </w:rPr>
+              <w:t>Sesion dev activa y API mockeada</w:t>
+            </w:r>
+          </w:p>
+        </w:tc>
+      </w:tr>
+      <w:tr>
+        <w:tc>
+          <w:tcPr>
+            <w:tcW w:type="dxa" w:w="2304"/>
+            <w:vAlign w:val="top"/>
+          </w:tcPr>
+          <w:p>
+            <w:r>
+              <w:rPr>
+                <w:b/>
+                <w:sz w:val="16"/>
+              </w:rPr>
+              <w:t>Datos de entrada</w:t>
+            </w:r>
+          </w:p>
+        </w:tc>
+        <w:tc>
+          <w:tcPr>
+            <w:tcW w:type="dxa" w:w="4968"/>
+            <w:vAlign w:val="top"/>
+          </w:tcPr>
+          <w:p>
+            <w:r>
+              <w:rPr>
+                <w:sz w:val="16"/>
+              </w:rPr>
+              <w:t>click en tab Ruta</w:t>
+            </w:r>
+          </w:p>
+        </w:tc>
+      </w:tr>
+      <w:tr>
+        <w:tc>
+          <w:tcPr>
+            <w:tcW w:type="dxa" w:w="2304"/>
+            <w:vAlign w:val="top"/>
+          </w:tcPr>
+          <w:p>
+            <w:r>
+              <w:rPr>
+                <w:b/>
+                <w:sz w:val="16"/>
+              </w:rPr>
+              <w:t>Pasos de ejecucion</w:t>
+            </w:r>
+          </w:p>
+        </w:tc>
+        <w:tc>
+          <w:tcPr>
+            <w:tcW w:type="dxa" w:w="4968"/>
+            <w:vAlign w:val="top"/>
+          </w:tcPr>
+          <w:p>
+            <w:r>
+              <w:rPr>
+                <w:sz w:val="16"/>
+              </w:rPr>
+              <w:t>1. Preparar el entorno de pruebas del modulo Ruta UI. 2. Ejecutar npm test -- --runInBand. 3. Localizar el caso CP-FE-E2E-002 en e2e/app-flows.spec.ts. 4. Usar datos de entrada: click en tab Ruta. 5. Comparar la salida observada contra el resultado esperado. 6. Registrar estado y evidencia en el informe de ciclo.</w:t>
+            </w:r>
+          </w:p>
+        </w:tc>
+      </w:tr>
+      <w:tr>
+        <w:tc>
+          <w:tcPr>
+            <w:tcW w:type="dxa" w:w="2304"/>
+            <w:vAlign w:val="top"/>
+          </w:tcPr>
+          <w:p>
+            <w:r>
+              <w:rPr>
+                <w:b/>
+                <w:sz w:val="16"/>
+              </w:rPr>
+              <w:t>Resultado esperado</w:t>
+            </w:r>
+          </w:p>
+        </w:tc>
+        <w:tc>
+          <w:tcPr>
+            <w:tcW w:type="dxa" w:w="4968"/>
+            <w:vAlign w:val="top"/>
+          </w:tcPr>
+          <w:p>
+            <w:r>
+              <w:rPr>
+                <w:sz w:val="16"/>
+              </w:rPr>
+              <w:t>Muestra secuencia recomendada con algoritmos</w:t>
+            </w:r>
+          </w:p>
+        </w:tc>
+      </w:tr>
+      <w:tr>
+        <w:tc>
+          <w:tcPr>
+            <w:tcW w:type="dxa" w:w="2304"/>
+            <w:vAlign w:val="top"/>
+          </w:tcPr>
+          <w:p>
+            <w:r>
+              <w:rPr>
+                <w:b/>
+                <w:sz w:val="16"/>
+              </w:rPr>
+              <w:t>Notas / Evidencia</w:t>
+            </w:r>
+          </w:p>
+        </w:tc>
+        <w:tc>
+          <w:tcPr>
+            <w:tcW w:type="dxa" w:w="4968"/>
+            <w:vAlign w:val="top"/>
+          </w:tcPr>
+          <w:p>
+            <w:r>
+              <w:rPr>
+                <w:sz w:val="16"/>
+              </w:rPr>
+              <w:t>Evidencia automatizada en e2e/app-flows.spec.ts. Resultado del ciclo: Paso.</w:t>
+            </w:r>
+          </w:p>
+        </w:tc>
+      </w:tr>
+    </w:tbl>
+    <w:p/>
+    <w:p>
+      <w:pPr>
+        <w:pStyle w:val="Heading1"/>
+      </w:pPr>
+      <w:r>
+        <w:t>24. MODULO: PERFIL UI</w:t>
+      </w:r>
+    </w:p>
+    <w:p>
+      <w:r>
+        <w:t>Modulo cubierto por pruebas automatizadas del proyecto BrainSort.</w:t>
+      </w:r>
+    </w:p>
+    <w:p>
+      <w:pPr>
+        <w:pStyle w:val="Heading2"/>
+      </w:pPr>
+      <w:r>
+        <w:t>Casos de prueba — Perfil UI</w:t>
+      </w:r>
+    </w:p>
+    <w:tbl>
+      <w:tblPr>
+        <w:tblStyle w:val="LightGrid-Accent1"/>
+        <w:tblW w:type="auto" w:w="0"/>
+        <w:jc w:val="center"/>
+        <w:tblLook w:firstColumn="1" w:firstRow="1" w:lastColumn="0" w:lastRow="0" w:noHBand="0" w:noVBand="1" w:val="04A0"/>
+      </w:tblPr>
+      <w:tblGrid>
+        <w:gridCol w:w="4968"/>
+        <w:gridCol w:w="4968"/>
+      </w:tblGrid>
+      <w:tr>
+        <w:tc>
+          <w:tcPr>
+            <w:tcW w:type="dxa" w:w="9936"/>
+            <w:gridSpan w:val="2"/>
+          </w:tcPr>
+          <w:p>
+            <w:r>
+              <w:rPr>
+                <w:b/>
+                <w:color w:val="1F3A5F"/>
+                <w:sz w:val="19"/>
+              </w:rPr>
+              <w:t>CP-FE-E2E-003 — Perfil muestra y actualiza nombre</w:t>
+            </w:r>
+          </w:p>
+        </w:tc>
+      </w:tr>
+      <w:tr>
+        <w:tc>
+          <w:tcPr>
+            <w:tcW w:type="dxa" w:w="2304"/>
+            <w:vAlign w:val="top"/>
+          </w:tcPr>
+          <w:p>
+            <w:r>
+              <w:rPr>
+                <w:b/>
+                <w:sz w:val="16"/>
+              </w:rPr>
+              <w:t>Modulo / HU / Tipo / Prioridad / Estado</w:t>
+            </w:r>
+          </w:p>
+        </w:tc>
+        <w:tc>
+          <w:tcPr>
+            <w:tcW w:type="dxa" w:w="4968"/>
+            <w:vAlign w:val="top"/>
+          </w:tcPr>
+          <w:p>
+            <w:r>
+              <w:rPr>
+                <w:sz w:val="16"/>
+              </w:rPr>
+              <w:t>Perfil UI | RF-USR | E2E Web | Alta | Paso</w:t>
+            </w:r>
+          </w:p>
+        </w:tc>
+      </w:tr>
+      <w:tr>
+        <w:tc>
+          <w:tcPr>
+            <w:tcW w:type="dxa" w:w="2304"/>
+            <w:vAlign w:val="top"/>
+          </w:tcPr>
+          <w:p>
+            <w:r>
+              <w:rPr>
+                <w:b/>
+                <w:sz w:val="16"/>
+              </w:rPr>
+              <w:t>Precondiciones</w:t>
+            </w:r>
+          </w:p>
+        </w:tc>
+        <w:tc>
+          <w:tcPr>
+            <w:tcW w:type="dxa" w:w="4968"/>
+            <w:vAlign w:val="top"/>
+          </w:tcPr>
+          <w:p>
+            <w:r>
+              <w:rPr>
+                <w:sz w:val="16"/>
+              </w:rPr>
+              <w:t>Sesion dev activa y API mockeada</w:t>
+            </w:r>
+          </w:p>
+        </w:tc>
+      </w:tr>
+      <w:tr>
+        <w:tc>
+          <w:tcPr>
+            <w:tcW w:type="dxa" w:w="2304"/>
+            <w:vAlign w:val="top"/>
+          </w:tcPr>
+          <w:p>
+            <w:r>
+              <w:rPr>
+                <w:b/>
+                <w:sz w:val="16"/>
+              </w:rPr>
+              <w:t>Datos de entrada</w:t>
+            </w:r>
+          </w:p>
+        </w:tc>
+        <w:tc>
+          <w:tcPr>
+            <w:tcW w:type="dxa" w:w="4968"/>
+            <w:vAlign w:val="top"/>
+          </w:tcPr>
+          <w:p>
+            <w:r>
+              <w:rPr>
+                <w:sz w:val="16"/>
+              </w:rPr>
+              <w:t>editar nombre y guardar</w:t>
+            </w:r>
+          </w:p>
+        </w:tc>
+      </w:tr>
+      <w:tr>
+        <w:tc>
+          <w:tcPr>
+            <w:tcW w:type="dxa" w:w="2304"/>
+            <w:vAlign w:val="top"/>
+          </w:tcPr>
+          <w:p>
+            <w:r>
+              <w:rPr>
+                <w:b/>
+                <w:sz w:val="16"/>
+              </w:rPr>
+              <w:t>Pasos de ejecucion</w:t>
+            </w:r>
+          </w:p>
+        </w:tc>
+        <w:tc>
+          <w:tcPr>
+            <w:tcW w:type="dxa" w:w="4968"/>
+            <w:vAlign w:val="top"/>
+          </w:tcPr>
+          <w:p>
+            <w:r>
+              <w:rPr>
+                <w:sz w:val="16"/>
+              </w:rPr>
+              <w:t>1. Preparar el entorno de pruebas del modulo Perfil UI. 2. Ejecutar npm test -- --runInBand. 3. Localizar el caso CP-FE-E2E-003 en e2e/app-flows.spec.ts. 4. Usar datos de entrada: editar nombre y guardar. 5. Comparar la salida observada contra el resultado esperado. 6. Registrar estado y evidencia en el informe de ciclo.</w:t>
+            </w:r>
+          </w:p>
+        </w:tc>
+      </w:tr>
+      <w:tr>
+        <w:tc>
+          <w:tcPr>
+            <w:tcW w:type="dxa" w:w="2304"/>
+            <w:vAlign w:val="top"/>
+          </w:tcPr>
+          <w:p>
+            <w:r>
+              <w:rPr>
+                <w:b/>
+                <w:sz w:val="16"/>
+              </w:rPr>
+              <w:t>Resultado esperado</w:t>
+            </w:r>
+          </w:p>
+        </w:tc>
+        <w:tc>
+          <w:tcPr>
+            <w:tcW w:type="dxa" w:w="4968"/>
+            <w:vAlign w:val="top"/>
+          </w:tcPr>
+          <w:p>
+            <w:r>
+              <w:rPr>
+                <w:sz w:val="16"/>
+              </w:rPr>
+              <w:t>Muestra datos de usuario y persiste nombre local editado</w:t>
+            </w:r>
+          </w:p>
+        </w:tc>
+      </w:tr>
+      <w:tr>
+        <w:tc>
+          <w:tcPr>
+            <w:tcW w:type="dxa" w:w="2304"/>
+            <w:vAlign w:val="top"/>
+          </w:tcPr>
+          <w:p>
+            <w:r>
+              <w:rPr>
+                <w:b/>
+                <w:sz w:val="16"/>
+              </w:rPr>
+              <w:t>Notas / Evidencia</w:t>
+            </w:r>
+          </w:p>
+        </w:tc>
+        <w:tc>
+          <w:tcPr>
+            <w:tcW w:type="dxa" w:w="4968"/>
+            <w:vAlign w:val="top"/>
+          </w:tcPr>
+          <w:p>
+            <w:r>
+              <w:rPr>
+                <w:sz w:val="16"/>
+              </w:rPr>
+              <w:t>Evidencia automatizada en e2e/app-flows.spec.ts. Resultado del ciclo: Paso.</w:t>
             </w:r>
           </w:p>
         </w:tc>

</xml_diff>